<commit_message>
fix: update formatting for all templates
</commit_message>
<xml_diff>
--- a/certificate_generator/report_templates/heritage-recommendation-vary_v7.docx
+++ b/certificate_generator/report_templates/heritage-recommendation-vary_v7.docx
@@ -3864,12 +3864,20 @@
     </w:p>
     <w:p>
       <w:pPr>
+        <w:pStyle w:val="Normal"/>
         <w:widowControl w:val="1"/>
-        <w:spacing w:before="0" w:after="0" w:afterAutospacing="off" w:line="240" w:lineRule="auto"/>
-        <w:rPr>
+        <w:suppressLineNumbers w:val="0"/>
+        <w:bidi w:val="0"/>
+        <w:spacing w:before="0" w:beforeAutospacing="off" w:after="0" w:afterAutospacing="off" w:line="240" w:lineRule="auto"/>
+        <w:ind w:left="0" w:right="0"/>
+        <w:jc w:val="left"/>
+      </w:pPr>
+      <w:r>
+        <w:rPr>
+          <w:rStyle w:val="Strong"/>
           <w:rFonts w:ascii="Noto Sans" w:hAnsi="Noto Sans" w:eastAsia="Noto Sans" w:cs="Noto Sans"/>
-          <w:b w:val="0"/>
-          <w:bCs w:val="0"/>
+          <w:b w:val="1"/>
+          <w:bCs w:val="1"/>
           <w:i w:val="0"/>
           <w:iCs w:val="0"/>
           <w:noProof/>
@@ -3877,21 +3885,7 @@
           <w:szCs w:val="28"/>
           <w:lang w:val="en-AU"/>
         </w:rPr>
-      </w:pPr>
-      <w:r>
-        <w:rPr>
-          <w:rStyle w:val="Strong"/>
-          <w:rFonts w:ascii="Noto Sans" w:hAnsi="Noto Sans" w:eastAsia="Noto Sans" w:cs="Noto Sans"/>
-          <w:b w:val="1"/>
-          <w:bCs w:val="1"/>
-          <w:i w:val="0"/>
-          <w:iCs w:val="0"/>
-          <w:noProof/>
-          <w:sz w:val="28"/>
-          <w:szCs w:val="28"/>
-          <w:lang w:val="en-AU"/>
-        </w:rPr>
-        <w:t>Endnotes</w:t>
+        <w:t>References</w:t>
       </w:r>
     </w:p>
     <w:p>

</xml_diff>